<commit_message>
Polish Mikhail Udalov frontend resume wording
Co-authored-by: DiStarkova <DiStarkova@users.noreply.github.com>
</commit_message>
<xml_diff>
--- a/Udalov_Mikhail_Frontend_Resume.docx
+++ b/Udalov_Mikhail_Frontend_Resume.docx
@@ -47,7 +47,7 @@
         </w:rPr>
         <w:t>Набережные Челны  |  +7 (961) 495-18-92  |  7mishka29@gmail.com</w:t>
         <w:br/>
-        <w:t>Telegram: @NectoNoName  |  github.com/YdalovM</w:t>
+        <w:t>Telegram: t.me/NectoNoName  |  GitHub: github.com/YdalovM</w:t>
       </w:r>
     </w:p>
     <w:p>
@@ -79,7 +79,7 @@
           <w:b w:val="0"/>
           <w:sz w:val="22"/>
         </w:rPr>
-        <w:t>Frontend-разработчик с опытом коммерческой разработки на React и TypeScript. В ОЭЗ «Алабуга» разрабатывал внутренние HR-системы: оценка и адаптация сотрудников, сопровождение, обучение и учебные проекты; работал с WebSocket, сложными формами и таблицами, переиспользуемыми UI-компонентами. Вёл разработку в GitLab, участвовал в оптимизации интерфейсов и менторил новых сотрудников. После Алабуги — продуктовая разработка B2B-стартапа: заявки, документооборот, тендеры, роли и права; вёл ключевые модули от постановки до релиза в Agile-команде.</w:t>
+        <w:t>Frontend-разработчик (React / TypeScript) с коммерческим опытом в энтерпрайз- и продуктовой разработке. В ОЭЗ «Алабуга» создавал внутренние HR-системы (оценка, адаптация, обучение сотрудников): сложные формы и таблицы, WebSocket, переиспользуемый UI, оптимизация производительности. Вёл разработку в GitLab (MR, code review), обучал и онбордил новых сотрудников. Далее — B2B-продукт в сфере закупок и тендеров: вёл ключевые модули (заявки, документооборот, тендеры, роли и права) от постановки до релиза в Agile-команде с аналитиком и тестировщиком.</w:t>
       </w:r>
     </w:p>
     <w:p>
@@ -125,7 +125,7 @@
           <w:b w:val="0"/>
           <w:sz w:val="20"/>
         </w:rPr>
-        <w:t>IT-стартап / внутренний B2B-продукт  |  Ноябрь 2025 — Апрель 2026</w:t>
+        <w:t>B2B SaaS (закупки / тендеры / документооборот)  |  Ноябрь 2025 — Апрель 2026</w:t>
       </w:r>
     </w:p>
     <w:p>
@@ -140,7 +140,7 @@
           <w:b w:val="0"/>
           <w:sz w:val="22"/>
         </w:rPr>
-        <w:t>Разработал ключевой модуль заявок: список, карточку, создание и редактирование, поиск, фильтры, пагинацию и архив; вёл модуль от постановки до релиза.</w:t>
+        <w:t>С нуля разработал и довёл до релиза модуль заявок: список и карточка, CRUD, поиск, фильтры, пагинация, архив — основной пользовательский сценарий продукта.</w:t>
       </w:r>
     </w:p>
     <w:p>
@@ -155,7 +155,7 @@
           <w:b w:val="0"/>
           <w:sz w:val="22"/>
         </w:rPr>
-        <w:t>Реализовал сценарии для нескольких типов поставки: материалы, оборудование, услуги и техника; адаптировал их под новые бизнес-требования.</w:t>
+        <w:t>Реализовал бизнес-сценарии под разные типы поставки (материалы, оборудование, услуги, техника) и оперативно адаптировал UI под изменения требований.</w:t>
       </w:r>
     </w:p>
     <w:p>
@@ -170,7 +170,7 @@
           <w:b w:val="0"/>
           <w:sz w:val="22"/>
         </w:rPr>
-        <w:t>Добавил документооборот по заявке: загрузку и удаление файлов по категориям, открытие PDF и изображений в браузере, доработал приёмку.</w:t>
+        <w:t>Внедрил документооборот по заявке: загрузка/удаление файлов по категориям, просмотр PDF и изображений в браузере, доработка приёмки.</w:t>
       </w:r>
     </w:p>
     <w:p>
@@ -185,7 +185,7 @@
           <w:b w:val="0"/>
           <w:sz w:val="22"/>
         </w:rPr>
-        <w:t>Внедрил комментарии, историю изменений, вывод ошибок валидации, авторизацию и отображение данных с учётом ролей и прав доступа.</w:t>
+        <w:t>Добавил комментарии, историю изменений, понятный вывод ошибок валидации; реализовал авторизацию и отображение данных по ролям и правам доступа.</w:t>
       </w:r>
     </w:p>
     <w:p>
@@ -200,7 +200,7 @@
           <w:b w:val="0"/>
           <w:sz w:val="22"/>
         </w:rPr>
-        <w:t>Разработал справочники оборудования и техники с поиском, фильтрацией и пагинацией; адаптировал интерфейсы под мобильные экраны.</w:t>
+        <w:t>Собрал справочники оборудования и техники (поиск, фильтры, пагинация) и адаптировал ключевые экраны под мобильные устройства.</w:t>
       </w:r>
     </w:p>
     <w:p>
@@ -215,7 +215,7 @@
           <w:b w:val="0"/>
           <w:sz w:val="22"/>
         </w:rPr>
-        <w:t>Спроектировал frontend-архитектуру тендерного блока: типы, Redux-слой, API, async thunks, форму отправки, таблицу отчёта, выбор победителя и переторг.</w:t>
+        <w:t>Спроектировал frontend-архитектуру тендерного блока: TypeScript-типы, Redux-слой, API и async thunks, форма отправки, отчёт, выбор победителя и переторг.</w:t>
       </w:r>
     </w:p>
     <w:p>
@@ -230,7 +230,7 @@
           <w:b w:val="0"/>
           <w:sz w:val="22"/>
         </w:rPr>
-        <w:t>Реализовал журнал входного контроля с экспортом данных; выполнил рефакторинг структуры проекта. Работал в Agile-команде с аналитиком и тестировщиком.</w:t>
+        <w:t>Реализовал журнал входного контроля с экспортом данных; провёл рефакторинг структуры проекта. Работал в Agile-команде (аналитик + QA).</w:t>
       </w:r>
     </w:p>
     <w:p>
@@ -288,7 +288,7 @@
           <w:b w:val="0"/>
           <w:sz w:val="22"/>
         </w:rPr>
-        <w:t>Реализовывал сложные формы с валидацией, таблицы с фильтрацией и сортировкой, live-обновления через WebSocket (уведомления и актуальные данные без перезагрузки).</w:t>
+        <w:t>Реализовывал сложные формы с валидацией и таблицы с фильтрацией/сортировкой; внедрил live-обновления через WebSocket (уведомления и актуальные данные без перезагрузки).</w:t>
       </w:r>
     </w:p>
     <w:p>
@@ -303,7 +303,7 @@
           <w:b w:val="0"/>
           <w:sz w:val="22"/>
         </w:rPr>
-        <w:t>Собирал переиспользуемые UI-компоненты и поддерживал единообразие интерфейсов; оптимизировал загрузку: lazy load, memoization, работа с размером бандла.</w:t>
+        <w:t>Собирал библиотеку переиспользуемых UI-компонентов и поддерживал единый UI-kit; оптимизировал загрузку (lazy load, memoization, контроль размера бандла).</w:t>
       </w:r>
     </w:p>
     <w:p>
@@ -318,7 +318,7 @@
           <w:b w:val="0"/>
           <w:sz w:val="22"/>
         </w:rPr>
-        <w:t>Работал с RTK Query, Redux, MobX, REST API, Vite и Webpack; участвовал в проектировании архитектуры, рефакторинге и переносе частей приложений на более современный стек.</w:t>
+        <w:t>Работал со стеком RTK Query, Redux, MobX, REST API, Vite и Webpack; участвовал в проектировании архитектуры, рефакторинге и миграции частей приложений на современный стек.</w:t>
       </w:r>
     </w:p>
     <w:p>
@@ -333,7 +333,7 @@
           <w:b w:val="0"/>
           <w:sz w:val="22"/>
         </w:rPr>
-        <w:t>Вёл разработку в команде через GitLab: ветки, merge request’ы, code review и совместная работа с репозиторием.</w:t>
+        <w:t>Организовывал командную разработку в GitLab: ветвление, merge request’ы, code review и совместная работа с репозиторием.</w:t>
       </w:r>
     </w:p>
     <w:p>
@@ -348,7 +348,7 @@
           <w:b w:val="0"/>
           <w:sz w:val="22"/>
         </w:rPr>
-        <w:t>Проводил обучение и онбординг новых сотрудников: разбор учебных проектов, помощь с адаптацией в команде и техническим сопровождением задач.</w:t>
+        <w:t>Провёл онбординг и менторинг новых сотрудников: разбор учебных проектов, помощь с адаптацией в команде и сопровождением задач.</w:t>
       </w:r>
     </w:p>
     <w:p>
@@ -363,7 +363,7 @@
           <w:b w:val="0"/>
           <w:sz w:val="22"/>
         </w:rPr>
-        <w:t>Подключил локальный S3 для асинхронной подгрузки статики и участвовал во внедрении Blue-Green Deployment для одного из продуктов.</w:t>
+        <w:t>Подключил локальный S3 для асинхронной подгрузки статики; участвовал во внедрении Blue-Green Deployment для одного из продуктов.</w:t>
       </w:r>
     </w:p>
     <w:p>
@@ -395,7 +395,7 @@
           <w:b/>
           <w:sz w:val="22"/>
         </w:rPr>
-        <w:t>PrazdnikiPerm.ru</w:t>
+        <w:t>PrazdnikiPerm.ru — коммерческий лендинг</w:t>
       </w:r>
     </w:p>
     <w:p>
@@ -409,7 +409,7 @@
           <w:b w:val="0"/>
           <w:sz w:val="22"/>
         </w:rPr>
-        <w:t>Коммерческий лендинг для услуг аниматоров в Перми: структура под конверсию, программы, отзывы, контактные сценарии. https://prazdnikiperm.ru</w:t>
+        <w:t>Сайт услуг аниматоров в Перми: структура под конверсию, блоки программ и отзывов, контактные сценарии. Стек: HTML/CSS/JS. Ссылка: https://prazdnikiperm.ru</w:t>
       </w:r>
     </w:p>
     <w:p>
@@ -423,7 +423,7 @@
           <w:b/>
           <w:sz w:val="22"/>
         </w:rPr>
-        <w:t>KKal24.ru</w:t>
+        <w:t>KKal24.ru — сервис расчёта КБЖУ</w:t>
       </w:r>
     </w:p>
     <w:p>
@@ -437,7 +437,7 @@
           <w:b w:val="0"/>
           <w:sz w:val="22"/>
         </w:rPr>
-        <w:t>Онлайн-сервис для расчёта калорий, КБЖУ, BMR, TDEE и ИМТ с понятной подачей результата. https://kkal24.ru</w:t>
+        <w:t>Онлайн-калькулятор калорий, КБЖУ, BMR, TDEE и ИМТ с понятной подачей результата. Стек: JavaScript / frontend. Ссылка: https://kkal24.ru</w:t>
       </w:r>
     </w:p>
     <w:p>
@@ -460,6 +460,20 @@
     </w:p>
     <w:p>
       <w:pPr>
+        <w:spacing w:after="40" w:before="0"/>
+        <w:ind w:firstLine="0"/>
+      </w:pPr>
+      <w:r>
+        <w:rPr>
+          <w:rFonts w:ascii="Times New Roman" w:hAnsi="Times New Roman" w:eastAsia="Times New Roman"/>
+          <w:b/>
+          <w:sz w:val="22"/>
+        </w:rPr>
+        <w:t>Core: React, TypeScript, JavaScript, Redux Toolkit, RTK Query</w:t>
+      </w:r>
+    </w:p>
+    <w:p>
+      <w:pPr>
         <w:spacing w:after="80" w:before="0"/>
         <w:ind w:firstLine="0"/>
       </w:pPr>
@@ -469,7 +483,7 @@
           <w:b w:val="0"/>
           <w:sz w:val="22"/>
         </w:rPr>
-        <w:t>React, TypeScript, JavaScript, Redux Toolkit, RTK Query, MobX, REST API, WebSocket, HTML5, CSS3, Vite, Webpack, Git, GitLab, Material UI, адаптивный UI, сложные формы и таблицы, code review, рефакторинг, оптимизация производительности.</w:t>
+        <w:t>Также: MobX, REST API, WebSocket, HTML5, CSS3, Vite, Webpack, Git, GitLab, Material UI, адаптивный UI, сложные формы и таблицы, code review, рефакторинг, оптимизация производительности.</w:t>
       </w:r>
     </w:p>
     <w:p>
@@ -501,7 +515,7 @@
           <w:b w:val="0"/>
           <w:sz w:val="22"/>
         </w:rPr>
-        <w:t>Колледж нефтехимии и нефтепереработки им. Н.В. Лемаева — программист, специалист по информационным системам, разработчик веб- и мультимедийных приложений, 2025.</w:t>
+        <w:t>Колледж нефтехимии и нефтепереработки им. Н.В. Лемаева — программист, специалист по информационным системам, разработчик веб- и мультимедийных приложений (окончил в 2025; учёба совмещалась с работой).</w:t>
       </w:r>
     </w:p>
     <w:p>
@@ -563,7 +577,7 @@
         </w:rPr>
         <w:t>Русский — родной, английский — B1.</w:t>
         <w:br/>
-        <w:t>Полная занятость, офис / гибрид / удалённо.</w:t>
+        <w:t>Полная занятость: офис / гибрид / удалённо.</w:t>
       </w:r>
     </w:p>
     <w:sectPr>

</xml_diff>